<commit_message>
Add availability and start date to cover letter
Co-Authored-By: Claude Opus 5.5 <noreply@anthropic.com>
Claude-Session: https://claude.ai/code/session_01JjcP4xCcm7Up9wE3QBRZN1
</commit_message>
<xml_diff>
--- a/Robert_Heideman_Cover_Letter_PUSH.docx
+++ b/Robert_Heideman_Cover_Letter_PUSH.docx
@@ -54,7 +54,7 @@
         <w:rPr>
           <w:b w:val="0"/>
         </w:rPr>
-        <w:t>25 October 2026</w:t>
+        <w:t>26 October 2026</w:t>
       </w:r>
     </w:p>
     <w:p>
@@ -146,7 +146,7 @@
         <w:spacing w:after="160"/>
       </w:pPr>
       <w:r>
-        <w:t>I hold a current Queensland Blue Card (I've had a Working with Children Check for over 10 years), a current NDIS Worker Screening Check (Yellow Card) and a current Australian driver licence.</w:t>
+        <w:t>I hold a current Queensland Blue Card (I've had a Working with Children Check for over 10 years), a current NDIS Worker Screening Check (Yellow Card) and a current Australian driver licence. I can commit three days a week to PUSH! and could start from 22 November.</w:t>
       </w:r>
     </w:p>
     <w:p>

</xml_diff>

<commit_message>
Address cover letter to Sarah White
Co-Authored-By: Claude Opus 5.5 <noreply@anthropic.com>
Claude-Session: https://claude.ai/code/session_01JjcP4xCcm7Up9wE3QBRZN1
</commit_message>
<xml_diff>
--- a/Robert_Heideman_Cover_Letter_PUSH.docx
+++ b/Robert_Heideman_Cover_Letter_PUSH.docx
@@ -65,7 +65,7 @@
         <w:rPr>
           <w:b w:val="0"/>
         </w:rPr>
-        <w:t>Hiring Team – PUSH! Program</w:t>
+        <w:t>Sarah White</w:t>
       </w:r>
     </w:p>
     <w:p>
@@ -106,7 +106,7 @@
         <w:spacing w:after="160"/>
       </w:pPr>
       <w:r>
-        <w:t>Dear PUSH! Hiring Team,</w:t>
+        <w:t>Dear Sarah,</w:t>
       </w:r>
     </w:p>
     <w:p>

</xml_diff>